<commit_message>
AI-243 Ipatov Bohdan - Set Variant 11 on title page and throughout report
</commit_message>
<xml_diff>
--- a/students/ai-243/ipatov-bohdan/lab1/report.docx
+++ b/students/ai-243/ipatov-bohdan/lab1/report.docx
@@ -256,7 +256,7 @@
                 <w:color w:val="000000"/>
                 <w:sz w:val="24"/>
               </w:rPr>
-              <w:t>Варіант 11 (Тема: «Освіта»)</w:t>
+              <w:t>11</w:t>
             </w:r>
           </w:p>
         </w:tc>
@@ -1397,7 +1397,7 @@
           <w:color w:val="000000"/>
           <w:sz w:val="28"/>
         </w:rPr>
-        <w:t>Питання варіанта: «Поясни різницю між списком і кортежем у Python.»</w:t>
+        <w:t>Питання (варіант 11): «Поясни різницю між списком і кортежем у Python.»</w:t>
       </w:r>
     </w:p>
     <w:p>
@@ -2942,7 +2942,7 @@
           <w:color w:val="000000"/>
           <w:sz w:val="28"/>
         </w:rPr>
-        <w:t>Питання варіанта: «Поясни різницю між списком і кортежем у Python. Коротко.»</w:t>
+        <w:t>Питання (варіант 11): «Поясни різницю між списком і кортежем у Python. Коротко.»</w:t>
       </w:r>
     </w:p>
     <w:p>
@@ -3653,7 +3653,7 @@
           <w:color w:val="000000"/>
           <w:sz w:val="28"/>
         </w:rPr>
-        <w:t>Для оцінки продуктивності я використав три типи запитів різної складності (короткий, середній, довгий).</w:t>
+        <w:t>Для оцінки продуктивності я використав три типи запитів варіанта 11 різної складності (короткий, середній, довгий).</w:t>
       </w:r>
     </w:p>
     <w:p>
@@ -5418,7 +5418,7 @@
           <w:color w:val="000000"/>
           <w:sz w:val="28"/>
         </w:rPr>
-        <w:t>Тема варіанта: «Освіта». Я оцінив три моделі за 6 критеріями (максимум 2 бали за кожен, усього 12 балів).</w:t>
+        <w:t>Тема (варіант 11): «Освіта». Я оцінив три моделі за 6 критеріями (максимум 2 бали за кожен, усього 12 балів).</w:t>
       </w:r>
     </w:p>
     <w:p>
@@ -6997,7 +6997,7 @@
           <w:color w:val="000000"/>
           <w:sz w:val="28"/>
         </w:rPr>
-        <w:t>Завдання варіанта:</w:t>
+        <w:t>Завдання (варіант 11):</w:t>
       </w:r>
     </w:p>
     <w:p>

</xml_diff>